<commit_message>
Eddited the literature review
</commit_message>
<xml_diff>
--- a/Texts/Literature review.docx
+++ b/Texts/Literature review.docx
@@ -65,7 +65,19 @@
         <w:rPr>
           <w:lang w:val="en-US"/>
         </w:rPr>
-        <w:t>In the context of Transportation Demand Management (TDM), gamification-based systems have increasingly been adopted to encourage the use of more sustainable transportation modes such as public transport, cycling, walking, carpooling, and other shared mobility solutions. The rapid diffusion of smartphones and mobile sensing technologies has enabled the implementation of digital mobility platforms capable of tracking trips, providing real-time feedback, assigning rewards, and monitoring individual environmental impacts (</w:t>
+        <w:t xml:space="preserve">In the context of Transportation Demand Management (TDM), gamification-based systems have increasingly been adopted to encourage the use of more sustainable </w:t>
+      </w:r>
+      <w:r>
+        <w:rPr>
+          <w:lang w:val="en-US"/>
+        </w:rPr>
+        <w:t>transport</w:t>
+      </w:r>
+      <w:r>
+        <w:rPr>
+          <w:lang w:val="en-US"/>
+        </w:rPr>
+        <w:t xml:space="preserve"> modes such as public transport, cycling, walking, carpooling, and other shared mobility solutions. The rapid diffusion of smartphones and mobile sensing technologies has enabled the implementation of digital mobility platforms capable of tracking trips, providing real-time feedback, assigning rewards, and monitoring individual environmental impacts (</w:t>
       </w:r>
       <w:r>
         <w:rPr>
@@ -84,7 +96,19 @@
         <w:rPr>
           <w:lang w:val="en-US"/>
         </w:rPr>
-        <w:t xml:space="preserve"> At same time, many studies evaluated smartphones potential for behaviour change and a tool for promoting sustainable modes of transport </w:t>
+        <w:t xml:space="preserve"> At same time, many studies evaluated smartphones</w:t>
+      </w:r>
+      <w:r>
+        <w:rPr>
+          <w:lang w:val="en-US"/>
+        </w:rPr>
+        <w:t>’</w:t>
+      </w:r>
+      <w:r>
+        <w:rPr>
+          <w:lang w:val="en-US"/>
+        </w:rPr>
+        <w:t xml:space="preserve"> potential for behaviour change and promoting sustainable modes of transport </w:t>
       </w:r>
       <w:r>
         <w:rPr>
@@ -169,14 +193,7 @@
           <w:color w:val="70AD47" w:themeColor="accent6"/>
           <w:lang w:val="en-US"/>
         </w:rPr>
-        <w:t>Bassanelli et al., 2025</w:t>
-      </w:r>
-      <w:r>
-        <w:rPr>
-          <w:color w:val="70AD47" w:themeColor="accent6"/>
-          <w:lang w:val="en-US"/>
-        </w:rPr>
-        <w:t xml:space="preserve"> </w:t>
+        <w:t xml:space="preserve">Bassanelli et al., 2025 </w:t>
       </w:r>
       <w:r>
         <w:rPr>
@@ -257,14 +274,7 @@
           <w:color w:val="70AD47" w:themeColor="accent6"/>
           <w:lang w:val="en-US"/>
         </w:rPr>
-        <w:t>Bassanelli et al., 2024a; Bucchiarone et al., 2023</w:t>
-      </w:r>
-      <w:r>
-        <w:rPr>
-          <w:color w:val="70AD47" w:themeColor="accent6"/>
-          <w:lang w:val="en-US"/>
-        </w:rPr>
-        <w:t>a</w:t>
+        <w:t>Bassanelli et al., 2024a; Bucchiarone et al., 2023a</w:t>
       </w:r>
       <w:r>
         <w:rPr>
@@ -302,7 +312,7 @@
         <w:rPr>
           <w:lang w:val="en-US"/>
         </w:rPr>
-        <w:t>while relatively fewer studies focus specifically on</w:t>
+        <w:t>while relatively fewer studies focus on</w:t>
       </w:r>
       <w:r>
         <w:rPr>
@@ -321,100 +331,51 @@
           <w:color w:val="70AD47" w:themeColor="accent6"/>
           <w:lang w:val="en-US"/>
         </w:rPr>
-        <w:t>Bowden &amp; Hellen, 2019; Kazhamiakin et al., 2015;</w:t>
+        <w:t>Bowden &amp; Hellen, 2019; Kazhamiakin et al., 2015; Khoshkangini et al., 2021</w:t>
+      </w:r>
+      <w:r>
+        <w:rPr>
+          <w:lang w:val="en-US"/>
+        </w:rPr>
+        <w:t>)</w:t>
+      </w:r>
+      <w:r>
+        <w:rPr>
+          <w:lang w:val="en-US"/>
+        </w:rPr>
+        <w:t>, teachers</w:t>
+      </w:r>
+      <w:r>
+        <w:rPr>
+          <w:lang w:val="en-US"/>
+        </w:rPr>
+        <w:t xml:space="preserve"> (</w:t>
       </w:r>
       <w:r>
         <w:rPr>
           <w:color w:val="70AD47" w:themeColor="accent6"/>
           <w:lang w:val="en-US"/>
         </w:rPr>
-        <w:t xml:space="preserve"> </w:t>
+        <w:t>Bassanelli et al., 2024a; Biondi et al., 2022; Bucchiarone et al., 2023a</w:t>
+      </w:r>
+      <w:r>
+        <w:rPr>
+          <w:lang w:val="en-US"/>
+        </w:rPr>
+        <w:t>)</w:t>
+      </w:r>
+      <w:r>
+        <w:rPr>
+          <w:lang w:val="en-US"/>
+        </w:rPr>
+        <w:t>, schoolers (</w:t>
       </w:r>
       <w:r>
         <w:rPr>
           <w:color w:val="70AD47" w:themeColor="accent6"/>
           <w:lang w:val="en-US"/>
         </w:rPr>
-        <w:t>Khoshkangini et al., 2021</w:t>
-      </w:r>
-      <w:r>
-        <w:rPr>
-          <w:lang w:val="en-US"/>
-        </w:rPr>
-        <w:t>)</w:t>
-      </w:r>
-      <w:r>
-        <w:rPr>
-          <w:lang w:val="en-US"/>
-        </w:rPr>
-        <w:t>, teachers</w:t>
-      </w:r>
-      <w:r>
-        <w:rPr>
-          <w:lang w:val="en-US"/>
-        </w:rPr>
-        <w:t xml:space="preserve"> (</w:t>
-      </w:r>
-      <w:r>
-        <w:rPr>
-          <w:color w:val="70AD47" w:themeColor="accent6"/>
-          <w:lang w:val="en-US"/>
-        </w:rPr>
-        <w:t>Bassanelli et al., 2024a; Biondi et al., 2022; Bucchiarone et al., 2023</w:t>
-      </w:r>
-      <w:r>
-        <w:rPr>
-          <w:color w:val="70AD47" w:themeColor="accent6"/>
-          <w:lang w:val="en-US"/>
-        </w:rPr>
-        <w:t>a</w:t>
-      </w:r>
-      <w:r>
-        <w:rPr>
-          <w:lang w:val="en-US"/>
-        </w:rPr>
-        <w:t>)</w:t>
-      </w:r>
-      <w:r>
-        <w:rPr>
-          <w:lang w:val="en-US"/>
-        </w:rPr>
-        <w:t>, schoolers (</w:t>
-      </w:r>
-      <w:r>
-        <w:rPr>
-          <w:color w:val="70AD47" w:themeColor="accent6"/>
-          <w:lang w:val="en-US"/>
-        </w:rPr>
-        <w:t>Bassanelli et al., 2024a; Bucchiarone et al., 2023a</w:t>
-      </w:r>
-      <w:r>
-        <w:rPr>
-          <w:color w:val="70AD47" w:themeColor="accent6"/>
-          <w:lang w:val="en-US"/>
-        </w:rPr>
-        <w:t xml:space="preserve">, </w:t>
-      </w:r>
-      <w:r>
-        <w:rPr>
-          <w:color w:val="70AD47" w:themeColor="accent6"/>
-          <w:lang w:val="en-US"/>
-        </w:rPr>
-        <w:t>Biondi et al., 2022; Rogelj et al., 2024</w:t>
-      </w:r>
-      <w:r>
-        <w:rPr>
-          <w:color w:val="70AD47" w:themeColor="accent6"/>
-          <w:lang w:val="en-US"/>
-        </w:rPr>
-        <w:t>)</w:t>
-      </w:r>
-      <w:r>
-        <w:rPr>
-          <w:color w:val="70AD47" w:themeColor="accent6"/>
-          <w:lang w:val="en-US"/>
-        </w:rPr>
-        <w:t xml:space="preserve"> </w:t>
+        <w:t xml:space="preserve">Bassanelli et al., 2024a; Bucchiarone et al., 2023a, Biondi et al., 2022; Rogelj et al., 2024) </w:t>
       </w:r>
       <w:r>
         <w:rPr>
@@ -1314,6 +1275,7 @@
   <w:style w:type="character" w:default="1" w:styleId="DefaultParagraphFont">
     <w:name w:val="Default Paragraph Font"/>
     <w:uiPriority w:val="1"/>
+    <w:semiHidden/>
     <w:unhideWhenUsed/>
   </w:style>
   <w:style w:type="table" w:default="1" w:styleId="TableNormal">

</xml_diff>